<commit_message>
More detailed commentation for notebook 3
</commit_message>
<xml_diff>
--- a/next_steps.docx
+++ b/next_steps.docx
@@ -1044,7 +1044,15 @@
                 <w:szCs w:val="22"/>
                 <w:lang w:val="en-US"/>
               </w:rPr>
-              <w:t>3 h</w:t>
+              <w:t>2</w:t>
+            </w:r>
+            <w:r>
+              <w:rPr>
+                <w:sz w:val="22"/>
+                <w:szCs w:val="22"/>
+                <w:lang w:val="en-US"/>
+              </w:rPr>
+              <w:t xml:space="preserve"> h</w:t>
             </w:r>
           </w:p>
         </w:tc>
@@ -1141,132 +1149,6 @@
                 <w:lang w:val="en-US"/>
               </w:rPr>
               <w:t>1 h</w:t>
-            </w:r>
-          </w:p>
-        </w:tc>
-      </w:tr>
-      <w:tr>
-        <w:tc>
-          <w:tcPr>
-            <w:tcW w:w="3964" w:type="dxa"/>
-          </w:tcPr>
-          <w:p>
-            <w:pPr>
-              <w:rPr>
-                <w:sz w:val="22"/>
-                <w:szCs w:val="22"/>
-                <w:lang w:val="en-US"/>
-              </w:rPr>
-            </w:pPr>
-            <w:r>
-              <w:rPr>
-                <w:sz w:val="22"/>
-                <w:szCs w:val="22"/>
-                <w:lang w:val="en-US"/>
-              </w:rPr>
-              <w:t xml:space="preserve">Run </w:t>
-            </w:r>
-            <w:r>
-              <w:rPr>
-                <w:i/>
-                <w:iCs/>
-                <w:sz w:val="22"/>
-                <w:szCs w:val="22"/>
-                <w:lang w:val="en-US"/>
-              </w:rPr>
-              <w:t>4</w:t>
-            </w:r>
-            <w:r>
-              <w:rPr>
-                <w:i/>
-                <w:iCs/>
-                <w:sz w:val="22"/>
-                <w:szCs w:val="22"/>
-                <w:lang w:val="en-US"/>
-              </w:rPr>
-              <w:t>_</w:t>
-            </w:r>
-            <w:r>
-              <w:rPr>
-                <w:i/>
-                <w:iCs/>
-                <w:sz w:val="22"/>
-                <w:szCs w:val="22"/>
-                <w:lang w:val="en-US"/>
-              </w:rPr>
-              <w:t>averaging</w:t>
-            </w:r>
-            <w:r>
-              <w:rPr>
-                <w:i/>
-                <w:iCs/>
-                <w:sz w:val="22"/>
-                <w:szCs w:val="22"/>
-                <w:lang w:val="en-US"/>
-              </w:rPr>
-              <w:t>.ipynb</w:t>
-            </w:r>
-            <w:r>
-              <w:rPr>
-                <w:i/>
-                <w:iCs/>
-                <w:sz w:val="22"/>
-                <w:szCs w:val="22"/>
-                <w:lang w:val="en-US"/>
-              </w:rPr>
-              <w:t xml:space="preserve"> </w:t>
-            </w:r>
-            <w:r>
-              <w:rPr>
-                <w:sz w:val="22"/>
-                <w:szCs w:val="22"/>
-                <w:lang w:val="en-US"/>
-              </w:rPr>
-              <w:t>just out of curiosity</w:t>
-            </w:r>
-          </w:p>
-        </w:tc>
-        <w:tc>
-          <w:tcPr>
-            <w:tcW w:w="2329" w:type="dxa"/>
-          </w:tcPr>
-          <w:p>
-            <w:pPr>
-              <w:rPr>
-                <w:sz w:val="22"/>
-                <w:szCs w:val="22"/>
-                <w:lang w:val="en-US"/>
-              </w:rPr>
-            </w:pPr>
-            <w:r>
-              <w:rPr>
-                <w:sz w:val="22"/>
-                <w:szCs w:val="22"/>
-                <w:lang w:val="en-US"/>
-              </w:rPr>
-              <w:t>20. – 24.7.</w:t>
-            </w:r>
-          </w:p>
-        </w:tc>
-        <w:tc>
-          <w:tcPr>
-            <w:tcW w:w="2769" w:type="dxa"/>
-          </w:tcPr>
-          <w:p>
-            <w:pPr>
-              <w:rPr>
-                <w:sz w:val="22"/>
-                <w:szCs w:val="22"/>
-                <w:lang w:val="en-US"/>
-              </w:rPr>
-            </w:pPr>
-            <w:r>
-              <w:rPr>
-                <w:sz w:val="22"/>
-                <w:szCs w:val="22"/>
-                <w:lang w:val="en-US"/>
-              </w:rPr>
-              <w:t>0,5 h</w:t>
             </w:r>
           </w:p>
         </w:tc>
@@ -1468,7 +1350,7 @@
                 <w:szCs w:val="22"/>
                 <w:lang w:val="en-US"/>
               </w:rPr>
-              <w:t>3h h</w:t>
+              <w:t xml:space="preserve">3h </w:t>
             </w:r>
           </w:p>
         </w:tc>
@@ -1477,22 +1359,25 @@
         <w:tc>
           <w:tcPr>
             <w:tcW w:w="3964" w:type="dxa"/>
-          </w:tcPr>
-          <w:p>
-            <w:pPr>
-              <w:rPr>
-                <w:sz w:val="22"/>
-                <w:szCs w:val="22"/>
-                <w:lang w:val="en-US"/>
-              </w:rPr>
-            </w:pPr>
-            <w:r>
-              <w:rPr>
-                <w:sz w:val="22"/>
-                <w:szCs w:val="22"/>
-                <w:lang w:val="en-US"/>
-              </w:rPr>
-              <w:t xml:space="preserve">Adjust and comment </w:t>
+            <w:tcBorders>
+              <w:bottom w:val="single" w:sz="12" w:space="0" w:color="auto"/>
+            </w:tcBorders>
+          </w:tcPr>
+          <w:p>
+            <w:pPr>
+              <w:rPr>
+                <w:sz w:val="22"/>
+                <w:szCs w:val="22"/>
+                <w:lang w:val="en-US"/>
+              </w:rPr>
+            </w:pPr>
+            <w:r>
+              <w:rPr>
+                <w:sz w:val="22"/>
+                <w:szCs w:val="22"/>
+                <w:lang w:val="en-US"/>
+              </w:rPr>
+              <w:t xml:space="preserve">Run </w:t>
             </w:r>
             <w:r>
               <w:rPr>
@@ -1502,6 +1387,141 @@
                 <w:szCs w:val="22"/>
                 <w:lang w:val="en-US"/>
               </w:rPr>
+              <w:t>4</w:t>
+            </w:r>
+            <w:r>
+              <w:rPr>
+                <w:i/>
+                <w:iCs/>
+                <w:sz w:val="22"/>
+                <w:szCs w:val="22"/>
+                <w:lang w:val="en-US"/>
+              </w:rPr>
+              <w:t>_</w:t>
+            </w:r>
+            <w:r>
+              <w:rPr>
+                <w:i/>
+                <w:iCs/>
+                <w:sz w:val="22"/>
+                <w:szCs w:val="22"/>
+                <w:lang w:val="en-US"/>
+              </w:rPr>
+              <w:t>averaging</w:t>
+            </w:r>
+            <w:r>
+              <w:rPr>
+                <w:i/>
+                <w:iCs/>
+                <w:sz w:val="22"/>
+                <w:szCs w:val="22"/>
+                <w:lang w:val="en-US"/>
+              </w:rPr>
+              <w:t>.ipynb</w:t>
+            </w:r>
+            <w:r>
+              <w:rPr>
+                <w:i/>
+                <w:iCs/>
+                <w:sz w:val="22"/>
+                <w:szCs w:val="22"/>
+                <w:lang w:val="en-US"/>
+              </w:rPr>
+              <w:t xml:space="preserve"> </w:t>
+            </w:r>
+            <w:r>
+              <w:rPr>
+                <w:sz w:val="22"/>
+                <w:szCs w:val="22"/>
+                <w:lang w:val="en-US"/>
+              </w:rPr>
+              <w:t>just out of curiosity</w:t>
+            </w:r>
+          </w:p>
+        </w:tc>
+        <w:tc>
+          <w:tcPr>
+            <w:tcW w:w="2329" w:type="dxa"/>
+            <w:tcBorders>
+              <w:bottom w:val="single" w:sz="12" w:space="0" w:color="auto"/>
+            </w:tcBorders>
+          </w:tcPr>
+          <w:p>
+            <w:pPr>
+              <w:rPr>
+                <w:sz w:val="22"/>
+                <w:szCs w:val="22"/>
+                <w:lang w:val="en-US"/>
+              </w:rPr>
+            </w:pPr>
+            <w:r>
+              <w:rPr>
+                <w:sz w:val="22"/>
+                <w:szCs w:val="22"/>
+                <w:lang w:val="en-US"/>
+              </w:rPr>
+              <w:t>20. – 24.7.</w:t>
+            </w:r>
+          </w:p>
+        </w:tc>
+        <w:tc>
+          <w:tcPr>
+            <w:tcW w:w="2769" w:type="dxa"/>
+            <w:tcBorders>
+              <w:bottom w:val="single" w:sz="12" w:space="0" w:color="auto"/>
+            </w:tcBorders>
+          </w:tcPr>
+          <w:p>
+            <w:pPr>
+              <w:rPr>
+                <w:sz w:val="22"/>
+                <w:szCs w:val="22"/>
+                <w:lang w:val="en-US"/>
+              </w:rPr>
+            </w:pPr>
+            <w:r>
+              <w:rPr>
+                <w:sz w:val="22"/>
+                <w:szCs w:val="22"/>
+                <w:lang w:val="en-US"/>
+              </w:rPr>
+              <w:t>0,5 h</w:t>
+            </w:r>
+          </w:p>
+        </w:tc>
+      </w:tr>
+      <w:tr>
+        <w:tc>
+          <w:tcPr>
+            <w:tcW w:w="3964" w:type="dxa"/>
+            <w:tcBorders>
+              <w:top w:val="single" w:sz="12" w:space="0" w:color="auto"/>
+            </w:tcBorders>
+          </w:tcPr>
+          <w:p>
+            <w:pPr>
+              <w:rPr>
+                <w:sz w:val="22"/>
+                <w:szCs w:val="22"/>
+                <w:lang w:val="en-US"/>
+              </w:rPr>
+            </w:pPr>
+            <w:r>
+              <w:rPr>
+                <w:sz w:val="22"/>
+                <w:szCs w:val="22"/>
+                <w:lang w:val="en-US"/>
+              </w:rPr>
+              <w:t xml:space="preserve">Adjust and comment </w:t>
+            </w:r>
+            <w:r>
+              <w:rPr>
+                <w:i/>
+                <w:iCs/>
+                <w:sz w:val="22"/>
+                <w:szCs w:val="22"/>
+                <w:lang w:val="en-US"/>
+              </w:rPr>
               <w:t>4_averaging.ipynb</w:t>
             </w:r>
             <w:r>
@@ -1517,6 +1537,9 @@
         <w:tc>
           <w:tcPr>
             <w:tcW w:w="2329" w:type="dxa"/>
+            <w:tcBorders>
+              <w:top w:val="single" w:sz="12" w:space="0" w:color="auto"/>
+            </w:tcBorders>
           </w:tcPr>
           <w:p>
             <w:pPr>
@@ -1539,6 +1562,9 @@
         <w:tc>
           <w:tcPr>
             <w:tcW w:w="2769" w:type="dxa"/>
+            <w:tcBorders>
+              <w:top w:val="single" w:sz="12" w:space="0" w:color="auto"/>
+            </w:tcBorders>
           </w:tcPr>
           <w:p>
             <w:pPr>

</xml_diff>

<commit_message>
More comments for metadata merging in 3_preprocessing
</commit_message>
<xml_diff>
--- a/next_steps.docx
+++ b/next_steps.docx
@@ -699,23 +699,7 @@
                 <w:szCs w:val="22"/>
                 <w:lang w:val="en-US"/>
               </w:rPr>
-              <w:t>20. – 2</w:t>
-            </w:r>
-            <w:r>
-              <w:rPr>
-                <w:sz w:val="22"/>
-                <w:szCs w:val="22"/>
-                <w:lang w:val="en-US"/>
-              </w:rPr>
-              <w:t>4</w:t>
-            </w:r>
-            <w:r>
-              <w:rPr>
-                <w:sz w:val="22"/>
-                <w:szCs w:val="22"/>
-                <w:lang w:val="en-US"/>
-              </w:rPr>
-              <w:t>.7.</w:t>
+              <w:t>20. – 24.7.</w:t>
             </w:r>
           </w:p>
         </w:tc>
@@ -822,23 +806,7 @@
                 <w:szCs w:val="22"/>
                 <w:lang w:val="en-US"/>
               </w:rPr>
-              <w:t>20. – 2</w:t>
-            </w:r>
-            <w:r>
-              <w:rPr>
-                <w:sz w:val="22"/>
-                <w:szCs w:val="22"/>
-                <w:lang w:val="en-US"/>
-              </w:rPr>
-              <w:t>4</w:t>
-            </w:r>
-            <w:r>
-              <w:rPr>
-                <w:sz w:val="22"/>
-                <w:szCs w:val="22"/>
-                <w:lang w:val="en-US"/>
-              </w:rPr>
-              <w:t>.7.</w:t>
+              <w:t>20. – 24.7.</w:t>
             </w:r>
           </w:p>
         </w:tc>
@@ -909,23 +877,7 @@
                 <w:szCs w:val="22"/>
                 <w:lang w:val="en-US"/>
               </w:rPr>
-              <w:t>20. – 2</w:t>
-            </w:r>
-            <w:r>
-              <w:rPr>
-                <w:sz w:val="22"/>
-                <w:szCs w:val="22"/>
-                <w:lang w:val="en-US"/>
-              </w:rPr>
-              <w:t>4</w:t>
-            </w:r>
-            <w:r>
-              <w:rPr>
-                <w:sz w:val="22"/>
-                <w:szCs w:val="22"/>
-                <w:lang w:val="en-US"/>
-              </w:rPr>
-              <w:t>.7.</w:t>
+              <w:t>20. – 24.7.</w:t>
             </w:r>
           </w:p>
         </w:tc>
@@ -1061,6 +1013,7 @@
         <w:tc>
           <w:tcPr>
             <w:tcW w:w="3964" w:type="dxa"/>
+            <w:shd w:val="clear" w:color="auto" w:fill="C1F0C7" w:themeFill="accent3" w:themeFillTint="33"/>
           </w:tcPr>
           <w:p>
             <w:pPr>
@@ -1111,6 +1064,7 @@
         <w:tc>
           <w:tcPr>
             <w:tcW w:w="2329" w:type="dxa"/>
+            <w:shd w:val="clear" w:color="auto" w:fill="C1F0C7" w:themeFill="accent3" w:themeFillTint="33"/>
           </w:tcPr>
           <w:p>
             <w:pPr>
@@ -1133,6 +1087,7 @@
         <w:tc>
           <w:tcPr>
             <w:tcW w:w="2769" w:type="dxa"/>
+            <w:shd w:val="clear" w:color="auto" w:fill="C1F0C7" w:themeFill="accent3" w:themeFillTint="33"/>
           </w:tcPr>
           <w:p>
             <w:pPr>
@@ -1362,6 +1317,7 @@
             <w:tcBorders>
               <w:bottom w:val="single" w:sz="12" w:space="0" w:color="auto"/>
             </w:tcBorders>
+            <w:shd w:val="clear" w:color="auto" w:fill="C1F0C7" w:themeFill="accent3" w:themeFillTint="33"/>
           </w:tcPr>
           <w:p>
             <w:pPr>
@@ -1445,6 +1401,7 @@
             <w:tcBorders>
               <w:bottom w:val="single" w:sz="12" w:space="0" w:color="auto"/>
             </w:tcBorders>
+            <w:shd w:val="clear" w:color="auto" w:fill="C1F0C7" w:themeFill="accent3" w:themeFillTint="33"/>
           </w:tcPr>
           <w:p>
             <w:pPr>
@@ -1470,6 +1427,7 @@
             <w:tcBorders>
               <w:bottom w:val="single" w:sz="12" w:space="0" w:color="auto"/>
             </w:tcBorders>
+            <w:shd w:val="clear" w:color="auto" w:fill="C1F0C7" w:themeFill="accent3" w:themeFillTint="33"/>
           </w:tcPr>
           <w:p>
             <w:pPr>
@@ -1998,6 +1956,261 @@
         </w:tc>
       </w:tr>
     </w:tbl>
+    <w:p>
+      <w:pPr>
+        <w:rPr>
+          <w:b/>
+          <w:bCs/>
+          <w:sz w:val="22"/>
+          <w:szCs w:val="22"/>
+          <w:lang w:val="en-US"/>
+        </w:rPr>
+      </w:pPr>
+      <w:proofErr w:type="gramStart"/>
+      <w:r>
+        <w:rPr>
+          <w:b/>
+          <w:bCs/>
+          <w:sz w:val="22"/>
+          <w:szCs w:val="22"/>
+          <w:lang w:val="en-US"/>
+        </w:rPr>
+        <w:lastRenderedPageBreak/>
+        <w:t>Meeting with</w:t>
+      </w:r>
+      <w:proofErr w:type="gramEnd"/>
+      <w:r>
+        <w:rPr>
+          <w:b/>
+          <w:bCs/>
+          <w:sz w:val="22"/>
+          <w:szCs w:val="22"/>
+          <w:lang w:val="en-US"/>
+        </w:rPr>
+        <w:t xml:space="preserve"> Laura:</w:t>
+      </w:r>
+    </w:p>
+    <w:p>
+      <w:pPr>
+        <w:pStyle w:val="Listenabsatz"/>
+        <w:numPr>
+          <w:ilvl w:val="0"/>
+          <w:numId w:val="2"/>
+        </w:numPr>
+        <w:rPr>
+          <w:sz w:val="22"/>
+          <w:szCs w:val="22"/>
+          <w:lang w:val="en-US"/>
+        </w:rPr>
+      </w:pPr>
+      <w:r>
+        <w:rPr>
+          <w:sz w:val="22"/>
+          <w:szCs w:val="22"/>
+          <w:lang w:val="en-US"/>
+        </w:rPr>
+        <w:t>Show subjects_processing_stage.xlsx</w:t>
+      </w:r>
+    </w:p>
+    <w:p>
+      <w:pPr>
+        <w:pStyle w:val="Listenabsatz"/>
+        <w:numPr>
+          <w:ilvl w:val="1"/>
+          <w:numId w:val="2"/>
+        </w:numPr>
+        <w:rPr>
+          <w:sz w:val="22"/>
+          <w:szCs w:val="22"/>
+          <w:lang w:val="en-US"/>
+        </w:rPr>
+      </w:pPr>
+      <w:r>
+        <w:rPr>
+          <w:sz w:val="22"/>
+          <w:szCs w:val="22"/>
+          <w:lang w:val="en-US"/>
+        </w:rPr>
+        <w:t>Walk through the table… later: we’ll have a closer look at data curation</w:t>
+      </w:r>
+    </w:p>
+    <w:p>
+      <w:pPr>
+        <w:pStyle w:val="Listenabsatz"/>
+        <w:numPr>
+          <w:ilvl w:val="0"/>
+          <w:numId w:val="2"/>
+        </w:numPr>
+        <w:rPr>
+          <w:sz w:val="22"/>
+          <w:szCs w:val="22"/>
+          <w:lang w:val="en-US"/>
+        </w:rPr>
+      </w:pPr>
+      <w:r>
+        <w:rPr>
+          <w:sz w:val="22"/>
+          <w:szCs w:val="22"/>
+          <w:lang w:val="en-US"/>
+        </w:rPr>
+        <w:t>Walk through notebooks 1 to 3 briefly</w:t>
+      </w:r>
+    </w:p>
+    <w:p>
+      <w:pPr>
+        <w:pStyle w:val="Listenabsatz"/>
+        <w:numPr>
+          <w:ilvl w:val="0"/>
+          <w:numId w:val="2"/>
+        </w:numPr>
+        <w:rPr>
+          <w:sz w:val="22"/>
+          <w:szCs w:val="22"/>
+          <w:lang w:val="en-US"/>
+        </w:rPr>
+      </w:pPr>
+      <w:r>
+        <w:rPr>
+          <w:sz w:val="22"/>
+          <w:szCs w:val="22"/>
+          <w:lang w:val="en-US"/>
+        </w:rPr>
+        <w:t>Show averaging results</w:t>
+      </w:r>
+    </w:p>
+    <w:p>
+      <w:pPr>
+        <w:pStyle w:val="Listenabsatz"/>
+        <w:numPr>
+          <w:ilvl w:val="0"/>
+          <w:numId w:val="2"/>
+        </w:numPr>
+        <w:rPr>
+          <w:sz w:val="22"/>
+          <w:szCs w:val="22"/>
+          <w:lang w:val="en-US"/>
+        </w:rPr>
+      </w:pPr>
+      <w:r>
+        <w:rPr>
+          <w:sz w:val="22"/>
+          <w:szCs w:val="22"/>
+          <w:lang w:val="en-US"/>
+        </w:rPr>
+        <w:t>What I will share:</w:t>
+      </w:r>
+    </w:p>
+    <w:p>
+      <w:pPr>
+        <w:pStyle w:val="Listenabsatz"/>
+        <w:numPr>
+          <w:ilvl w:val="1"/>
+          <w:numId w:val="2"/>
+        </w:numPr>
+        <w:rPr>
+          <w:sz w:val="22"/>
+          <w:szCs w:val="22"/>
+          <w:lang w:val="en-US"/>
+        </w:rPr>
+      </w:pPr>
+      <w:r>
+        <w:rPr>
+          <w:sz w:val="22"/>
+          <w:szCs w:val="22"/>
+          <w:lang w:val="en-US"/>
+        </w:rPr>
+        <w:t>Preprocessed data</w:t>
+      </w:r>
+    </w:p>
+    <w:p>
+      <w:pPr>
+        <w:pStyle w:val="Listenabsatz"/>
+        <w:numPr>
+          <w:ilvl w:val="1"/>
+          <w:numId w:val="2"/>
+        </w:numPr>
+        <w:rPr>
+          <w:sz w:val="22"/>
+          <w:szCs w:val="22"/>
+          <w:lang w:val="en-US"/>
+        </w:rPr>
+      </w:pPr>
+      <w:r>
+        <w:rPr>
+          <w:sz w:val="22"/>
+          <w:szCs w:val="22"/>
+          <w:lang w:val="en-US"/>
+        </w:rPr>
+        <w:t>Notebooks 1 to 3</w:t>
+      </w:r>
+    </w:p>
+    <w:p>
+      <w:pPr>
+        <w:pStyle w:val="Listenabsatz"/>
+        <w:numPr>
+          <w:ilvl w:val="2"/>
+          <w:numId w:val="2"/>
+        </w:numPr>
+        <w:rPr>
+          <w:sz w:val="22"/>
+          <w:szCs w:val="22"/>
+          <w:lang w:val="en-US"/>
+        </w:rPr>
+      </w:pPr>
+      <w:r>
+        <w:rPr>
+          <w:sz w:val="22"/>
+          <w:szCs w:val="22"/>
+          <w:lang w:val="en-US"/>
+        </w:rPr>
+        <w:t>Did not manage to fully comment Notebook 3</w:t>
+      </w:r>
+    </w:p>
+    <w:p>
+      <w:pPr>
+        <w:pStyle w:val="Listenabsatz"/>
+        <w:numPr>
+          <w:ilvl w:val="1"/>
+          <w:numId w:val="2"/>
+        </w:numPr>
+        <w:rPr>
+          <w:sz w:val="22"/>
+          <w:szCs w:val="22"/>
+          <w:lang w:val="en-US"/>
+        </w:rPr>
+      </w:pPr>
+      <w:r>
+        <w:rPr>
+          <w:sz w:val="22"/>
+          <w:szCs w:val="22"/>
+          <w:lang w:val="en-US"/>
+        </w:rPr>
+        <w:t>Configuration file</w:t>
+      </w:r>
+    </w:p>
+    <w:p>
+      <w:pPr>
+        <w:rPr>
+          <w:sz w:val="22"/>
+          <w:szCs w:val="22"/>
+          <w:lang w:val="en-US"/>
+        </w:rPr>
+      </w:pPr>
+    </w:p>
+    <w:p>
+      <w:pPr>
+        <w:pStyle w:val="Listenabsatz"/>
+        <w:numPr>
+          <w:ilvl w:val="0"/>
+          <w:numId w:val="3"/>
+        </w:numPr>
+        <w:rPr>
+          <w:sz w:val="22"/>
+          <w:szCs w:val="22"/>
+          <w:lang w:val="en-US"/>
+        </w:rPr>
+      </w:pPr>
+    </w:p>
     <w:p>
       <w:pPr>
         <w:rPr>
@@ -2029,6 +2242,119 @@
 <file path=word/numbering.xml><?xml version="1.0" encoding="utf-8"?>
 <w:numbering xmlns:wpc="http://schemas.microsoft.com/office/word/2010/wordprocessingCanvas" xmlns:cx="http://schemas.microsoft.com/office/drawing/2014/chartex" xmlns:cx1="http://schemas.microsoft.com/office/drawing/2015/9/8/chartex" xmlns:cx2="http://schemas.microsoft.com/office/drawing/2015/10/21/chartex" xmlns:cx3="http://schemas.microsoft.com/office/drawing/2016/5/9/chartex" xmlns:cx4="http://schemas.microsoft.com/office/drawing/2016/5/10/chartex" xmlns:cx5="http://schemas.microsoft.com/office/drawing/2016/5/11/chartex" xmlns:cx6="http://schemas.microsoft.com/office/drawing/2016/5/12/chartex" xmlns:cx7="http://schemas.microsoft.com/office/drawing/2016/5/13/chartex" xmlns:cx8="http://schemas.microsoft.com/office/drawing/2016/5/14/chartex" xmlns:mc="http://schemas.openxmlformats.org/markup-compatibility/2006" xmlns:aink="http://schemas.microsoft.com/office/drawing/2016/ink" xmlns:am3d="http://schemas.microsoft.com/office/drawing/2017/model3d" xmlns:o="urn:schemas-microsoft-com:office:office" xmlns:oel="http://schemas.microsoft.com/office/2019/extlst" xmlns:r="http://schemas.openxmlformats.org/officeDocument/2006/relationships" xmlns:m="http://schemas.openxmlformats.org/officeDocument/2006/math" xmlns:v="urn:schemas-microsoft-com:vml" xmlns:wp14="http://schemas.microsoft.com/office/word/2010/wordprocessingDrawing" xmlns:wp="http://schemas.openxmlformats.org/drawingml/2006/wordprocessingDrawing" xmlns:w10="urn:schemas-microsoft-com:office:word" xmlns:w="http://schemas.openxmlformats.org/wordprocessingml/2006/main" xmlns:w14="http://schemas.microsoft.com/office/word/2010/wordml" xmlns:w15="http://schemas.microsoft.com/office/word/2012/wordml" xmlns:w16cex="http://schemas.microsoft.com/office/word/2018/wordml/cex" xmlns:w16cid="http://schemas.microsoft.com/office/word/2016/wordml/cid" xmlns:w16="http://schemas.microsoft.com/office/word/2018/wordml" xmlns:w16du="http://schemas.microsoft.com/office/word/2023/wordml/word16du" xmlns:w16sdtdh="http://schemas.microsoft.com/office/word/2020/wordml/sdtdatahash" xmlns:w16sdtfl="http://schemas.microsoft.com/office/word/2024/wordml/sdtformatlock" xmlns:w16se="http://schemas.microsoft.com/office/word/2015/wordml/symex" xmlns:wpg="http://schemas.microsoft.com/office/word/2010/wordprocessingGroup" xmlns:wpi="http://schemas.microsoft.com/office/word/2010/wordprocessingInk" xmlns:wne="http://schemas.microsoft.com/office/word/2006/wordml" xmlns:wps="http://schemas.microsoft.com/office/word/2010/wordprocessingShape" mc:Ignorable="w14 w15 w16se w16cid w16 w16cex w16sdtdh w16sdtfl w16du wp14">
   <w:abstractNum w:abstractNumId="0" w15:restartNumberingAfterBreak="0">
+    <w:nsid w:val="13D16924"/>
+    <w:multiLevelType w:val="hybridMultilevel"/>
+    <w:tmpl w:val="B810CFF8"/>
+    <w:lvl w:ilvl="0" w:tplc="04070001">
+      <w:start w:val="1"/>
+      <w:numFmt w:val="bullet"/>
+      <w:lvlText w:val=""/>
+      <w:lvlJc w:val="left"/>
+      <w:pPr>
+        <w:ind w:left="720" w:hanging="360"/>
+      </w:pPr>
+      <w:rPr>
+        <w:rFonts w:ascii="Symbol" w:hAnsi="Symbol" w:hint="default"/>
+      </w:rPr>
+    </w:lvl>
+    <w:lvl w:ilvl="1" w:tplc="04070003">
+      <w:start w:val="1"/>
+      <w:numFmt w:val="bullet"/>
+      <w:lvlText w:val="o"/>
+      <w:lvlJc w:val="left"/>
+      <w:pPr>
+        <w:ind w:left="1440" w:hanging="360"/>
+      </w:pPr>
+      <w:rPr>
+        <w:rFonts w:ascii="Courier New" w:hAnsi="Courier New" w:cs="Courier New" w:hint="default"/>
+      </w:rPr>
+    </w:lvl>
+    <w:lvl w:ilvl="2" w:tplc="04070005">
+      <w:start w:val="1"/>
+      <w:numFmt w:val="bullet"/>
+      <w:lvlText w:val=""/>
+      <w:lvlJc w:val="left"/>
+      <w:pPr>
+        <w:ind w:left="2160" w:hanging="360"/>
+      </w:pPr>
+      <w:rPr>
+        <w:rFonts w:ascii="Wingdings" w:hAnsi="Wingdings" w:hint="default"/>
+      </w:rPr>
+    </w:lvl>
+    <w:lvl w:ilvl="3" w:tplc="04070001" w:tentative="1">
+      <w:start w:val="1"/>
+      <w:numFmt w:val="bullet"/>
+      <w:lvlText w:val=""/>
+      <w:lvlJc w:val="left"/>
+      <w:pPr>
+        <w:ind w:left="2880" w:hanging="360"/>
+      </w:pPr>
+      <w:rPr>
+        <w:rFonts w:ascii="Symbol" w:hAnsi="Symbol" w:hint="default"/>
+      </w:rPr>
+    </w:lvl>
+    <w:lvl w:ilvl="4" w:tplc="04070003" w:tentative="1">
+      <w:start w:val="1"/>
+      <w:numFmt w:val="bullet"/>
+      <w:lvlText w:val="o"/>
+      <w:lvlJc w:val="left"/>
+      <w:pPr>
+        <w:ind w:left="3600" w:hanging="360"/>
+      </w:pPr>
+      <w:rPr>
+        <w:rFonts w:ascii="Courier New" w:hAnsi="Courier New" w:cs="Courier New" w:hint="default"/>
+      </w:rPr>
+    </w:lvl>
+    <w:lvl w:ilvl="5" w:tplc="04070005" w:tentative="1">
+      <w:start w:val="1"/>
+      <w:numFmt w:val="bullet"/>
+      <w:lvlText w:val=""/>
+      <w:lvlJc w:val="left"/>
+      <w:pPr>
+        <w:ind w:left="4320" w:hanging="360"/>
+      </w:pPr>
+      <w:rPr>
+        <w:rFonts w:ascii="Wingdings" w:hAnsi="Wingdings" w:hint="default"/>
+      </w:rPr>
+    </w:lvl>
+    <w:lvl w:ilvl="6" w:tplc="04070001" w:tentative="1">
+      <w:start w:val="1"/>
+      <w:numFmt w:val="bullet"/>
+      <w:lvlText w:val=""/>
+      <w:lvlJc w:val="left"/>
+      <w:pPr>
+        <w:ind w:left="5040" w:hanging="360"/>
+      </w:pPr>
+      <w:rPr>
+        <w:rFonts w:ascii="Symbol" w:hAnsi="Symbol" w:hint="default"/>
+      </w:rPr>
+    </w:lvl>
+    <w:lvl w:ilvl="7" w:tplc="04070003" w:tentative="1">
+      <w:start w:val="1"/>
+      <w:numFmt w:val="bullet"/>
+      <w:lvlText w:val="o"/>
+      <w:lvlJc w:val="left"/>
+      <w:pPr>
+        <w:ind w:left="5760" w:hanging="360"/>
+      </w:pPr>
+      <w:rPr>
+        <w:rFonts w:ascii="Courier New" w:hAnsi="Courier New" w:cs="Courier New" w:hint="default"/>
+      </w:rPr>
+    </w:lvl>
+    <w:lvl w:ilvl="8" w:tplc="04070005" w:tentative="1">
+      <w:start w:val="1"/>
+      <w:numFmt w:val="bullet"/>
+      <w:lvlText w:val=""/>
+      <w:lvlJc w:val="left"/>
+      <w:pPr>
+        <w:ind w:left="6480" w:hanging="360"/>
+      </w:pPr>
+      <w:rPr>
+        <w:rFonts w:ascii="Wingdings" w:hAnsi="Wingdings" w:hint="default"/>
+      </w:rPr>
+    </w:lvl>
+  </w:abstractNum>
+  <w:abstractNum w:abstractNumId="1" w15:restartNumberingAfterBreak="0">
     <w:nsid w:val="40AA6EF0"/>
     <w:multiLevelType w:val="hybridMultilevel"/>
     <w:tmpl w:val="399C8DB6"/>
@@ -2117,8 +2443,127 @@
       </w:pPr>
     </w:lvl>
   </w:abstractNum>
+  <w:abstractNum w:abstractNumId="2" w15:restartNumberingAfterBreak="0">
+    <w:nsid w:val="64310A37"/>
+    <w:multiLevelType w:val="hybridMultilevel"/>
+    <w:tmpl w:val="0CF09766"/>
+    <w:lvl w:ilvl="0" w:tplc="04070001">
+      <w:start w:val="1"/>
+      <w:numFmt w:val="bullet"/>
+      <w:lvlText w:val=""/>
+      <w:lvlJc w:val="left"/>
+      <w:pPr>
+        <w:ind w:left="720" w:hanging="360"/>
+      </w:pPr>
+      <w:rPr>
+        <w:rFonts w:ascii="Symbol" w:hAnsi="Symbol" w:hint="default"/>
+      </w:rPr>
+    </w:lvl>
+    <w:lvl w:ilvl="1" w:tplc="04070003" w:tentative="1">
+      <w:start w:val="1"/>
+      <w:numFmt w:val="bullet"/>
+      <w:lvlText w:val="o"/>
+      <w:lvlJc w:val="left"/>
+      <w:pPr>
+        <w:ind w:left="1440" w:hanging="360"/>
+      </w:pPr>
+      <w:rPr>
+        <w:rFonts w:ascii="Courier New" w:hAnsi="Courier New" w:cs="Courier New" w:hint="default"/>
+      </w:rPr>
+    </w:lvl>
+    <w:lvl w:ilvl="2" w:tplc="04070005" w:tentative="1">
+      <w:start w:val="1"/>
+      <w:numFmt w:val="bullet"/>
+      <w:lvlText w:val=""/>
+      <w:lvlJc w:val="left"/>
+      <w:pPr>
+        <w:ind w:left="2160" w:hanging="360"/>
+      </w:pPr>
+      <w:rPr>
+        <w:rFonts w:ascii="Wingdings" w:hAnsi="Wingdings" w:hint="default"/>
+      </w:rPr>
+    </w:lvl>
+    <w:lvl w:ilvl="3" w:tplc="04070001" w:tentative="1">
+      <w:start w:val="1"/>
+      <w:numFmt w:val="bullet"/>
+      <w:lvlText w:val=""/>
+      <w:lvlJc w:val="left"/>
+      <w:pPr>
+        <w:ind w:left="2880" w:hanging="360"/>
+      </w:pPr>
+      <w:rPr>
+        <w:rFonts w:ascii="Symbol" w:hAnsi="Symbol" w:hint="default"/>
+      </w:rPr>
+    </w:lvl>
+    <w:lvl w:ilvl="4" w:tplc="04070003" w:tentative="1">
+      <w:start w:val="1"/>
+      <w:numFmt w:val="bullet"/>
+      <w:lvlText w:val="o"/>
+      <w:lvlJc w:val="left"/>
+      <w:pPr>
+        <w:ind w:left="3600" w:hanging="360"/>
+      </w:pPr>
+      <w:rPr>
+        <w:rFonts w:ascii="Courier New" w:hAnsi="Courier New" w:cs="Courier New" w:hint="default"/>
+      </w:rPr>
+    </w:lvl>
+    <w:lvl w:ilvl="5" w:tplc="04070005" w:tentative="1">
+      <w:start w:val="1"/>
+      <w:numFmt w:val="bullet"/>
+      <w:lvlText w:val=""/>
+      <w:lvlJc w:val="left"/>
+      <w:pPr>
+        <w:ind w:left="4320" w:hanging="360"/>
+      </w:pPr>
+      <w:rPr>
+        <w:rFonts w:ascii="Wingdings" w:hAnsi="Wingdings" w:hint="default"/>
+      </w:rPr>
+    </w:lvl>
+    <w:lvl w:ilvl="6" w:tplc="04070001" w:tentative="1">
+      <w:start w:val="1"/>
+      <w:numFmt w:val="bullet"/>
+      <w:lvlText w:val=""/>
+      <w:lvlJc w:val="left"/>
+      <w:pPr>
+        <w:ind w:left="5040" w:hanging="360"/>
+      </w:pPr>
+      <w:rPr>
+        <w:rFonts w:ascii="Symbol" w:hAnsi="Symbol" w:hint="default"/>
+      </w:rPr>
+    </w:lvl>
+    <w:lvl w:ilvl="7" w:tplc="04070003" w:tentative="1">
+      <w:start w:val="1"/>
+      <w:numFmt w:val="bullet"/>
+      <w:lvlText w:val="o"/>
+      <w:lvlJc w:val="left"/>
+      <w:pPr>
+        <w:ind w:left="5760" w:hanging="360"/>
+      </w:pPr>
+      <w:rPr>
+        <w:rFonts w:ascii="Courier New" w:hAnsi="Courier New" w:cs="Courier New" w:hint="default"/>
+      </w:rPr>
+    </w:lvl>
+    <w:lvl w:ilvl="8" w:tplc="04070005" w:tentative="1">
+      <w:start w:val="1"/>
+      <w:numFmt w:val="bullet"/>
+      <w:lvlText w:val=""/>
+      <w:lvlJc w:val="left"/>
+      <w:pPr>
+        <w:ind w:left="6480" w:hanging="360"/>
+      </w:pPr>
+      <w:rPr>
+        <w:rFonts w:ascii="Wingdings" w:hAnsi="Wingdings" w:hint="default"/>
+      </w:rPr>
+    </w:lvl>
+  </w:abstractNum>
   <w:num w:numId="1" w16cid:durableId="1024091716">
+    <w:abstractNumId w:val="1"/>
+  </w:num>
+  <w:num w:numId="2" w16cid:durableId="298809218">
     <w:abstractNumId w:val="0"/>
+  </w:num>
+  <w:num w:numId="3" w16cid:durableId="848519593">
+    <w:abstractNumId w:val="2"/>
   </w:num>
 </w:numbering>
 </file>

</xml_diff>

<commit_message>
Finalized first QC section of Notebook 4, 2.1
</commit_message>
<xml_diff>
--- a/next_steps.docx
+++ b/next_steps.docx
@@ -1,10 +1,85 @@
 
 <file path=word/document.xml><?xml version="1.0" encoding="utf-8"?>
-<w:document xmlns:wpc="http://schemas.microsoft.com/office/word/2010/wordprocessingCanvas" xmlns:cx="http://schemas.microsoft.com/office/drawing/2014/chartex" xmlns:cx1="http://schemas.microsoft.com/office/drawing/2015/9/8/chartex" xmlns:cx2="http://schemas.microsoft.com/office/drawing/2015/10/21/chartex" xmlns:cx3="http://schemas.microsoft.com/office/drawing/2016/5/9/chartex" xmlns:cx4="http://schemas.microsoft.com/office/drawing/2016/5/10/chartex" xmlns:cx5="http://schemas.microsoft.com/office/drawing/2016/5/11/chartex" xmlns:cx6="http://schemas.microsoft.com/office/drawing/2016/5/12/chartex" xmlns:cx7="http://schemas.microsoft.com/office/drawing/2016/5/13/chartex" xmlns:cx8="http://schemas.microsoft.com/office/drawing/2016/5/14/chartex" xmlns:mc="http://schemas.openxmlformats.org/markup-compatibility/2006" xmlns:aink="http://schemas.microsoft.com/office/drawing/2016/ink" xmlns:am3d="http://schemas.microsoft.com/office/drawing/2017/model3d" xmlns:o="urn:schemas-microsoft-com:office:office" xmlns:oel="http://schemas.microsoft.com/office/2019/extlst" xmlns:r="http://schemas.openxmlformats.org/officeDocument/2006/relationships" xmlns:m="http://schemas.openxmlformats.org/officeDocument/2006/math" xmlns:v="urn:schemas-microsoft-com:vml" xmlns:wp14="http://schemas.microsoft.com/office/word/2010/wordprocessingDrawing" xmlns:wp="http://schemas.openxmlformats.org/drawingml/2006/wordprocessingDrawing" xmlns:w10="urn:schemas-microsoft-com:office:word" xmlns:w="http://schemas.openxmlformats.org/wordprocessingml/2006/main" xmlns:w14="http://schemas.microsoft.com/office/word/2010/wordml" xmlns:w15="http://schemas.microsoft.com/office/word/2012/wordml" xmlns:w16cex="http://schemas.microsoft.com/office/word/2018/wordml/cex" xmlns:w16cid="http://schemas.microsoft.com/office/word/2016/wordml/cid" xmlns:w16="http://schemas.microsoft.com/office/word/2018/wordml" xmlns:w16du="http://schemas.microsoft.com/office/word/2023/wordml/word16du" xmlns:w16sdtdh="http://schemas.microsoft.com/office/word/2020/wordml/sdtdatahash" xmlns:w16sdtfl="http://schemas.microsoft.com/office/word/2024/wordml/sdtformatlock" xmlns:w16se="http://schemas.microsoft.com/office/word/2015/wordml/symex" xmlns:wpg="http://schemas.microsoft.com/office/word/2010/wordprocessingGroup" xmlns:wpi="http://schemas.microsoft.com/office/word/2010/wordprocessingInk" xmlns:wne="http://schemas.microsoft.com/office/word/2006/wordml" xmlns:wps="http://schemas.microsoft.com/office/word/2010/wordprocessingShape" mc:Ignorable="w14 w15 w16se w16cid w16 w16cex w16sdtdh w16sdtfl w16du wp14">
+<w:document xmlns:wpc="http://schemas.microsoft.com/office/word/2010/wordprocessingCanvas" xmlns:cx="http://schemas.microsoft.com/office/drawing/2014/chartex" xmlns:cx1="http://schemas.microsoft.com/office/drawing/2015/9/8/chartex" xmlns:cx2="http://schemas.microsoft.com/office/drawing/2015/10/21/chartex" xmlns:cx3="http://schemas.microsoft.com/office/drawing/2016/5/9/chartex" xmlns:cx4="http://schemas.microsoft.com/office/drawing/2016/5/10/chartex" xmlns:cx5="http://schemas.microsoft.com/office/drawing/2016/5/11/chartex" xmlns:cx6="http://schemas.microsoft.com/office/drawing/2016/5/12/chartex" xmlns:cx7="http://schemas.microsoft.com/office/drawing/2016/5/13/chartex" xmlns:cx8="http://schemas.microsoft.com/office/drawing/2016/5/14/chartex" xmlns:mc="http://schemas.openxmlformats.org/markup-compatibility/2006" xmlns:aink="http://schemas.microsoft.com/office/drawing/2016/ink" xmlns:am3d="http://schemas.microsoft.com/office/drawing/2017/model3d" xmlns:o="urn:schemas-microsoft-com:office:office" xmlns:oel="http://schemas.microsoft.com/office/2019/extlst" xmlns:r="http://schemas.openxmlformats.org/officeDocument/2006/relationships" xmlns:m="http://schemas.openxmlformats.org/officeDocument/2006/math" xmlns:v="urn:schemas-microsoft-com:vml" xmlns:wp14="http://schemas.microsoft.com/office/word/2010/wordprocessingDrawing" xmlns:wp="http://schemas.openxmlformats.org/drawingml/2006/wordprocessingDrawing" xmlns:w10="urn:schemas-microsoft-com:office:word" xmlns:w="http://schemas.openxmlformats.org/wordprocessingml/2006/main" xmlns:w14="http://schemas.microsoft.com/office/word/2010/wordml" xmlns:w15="http://schemas.microsoft.com/office/word/2012/wordml" xmlns:w16cei="http://schemas.microsoft.com/office/word/2026/wordml/cei" xmlns:w16cex="http://schemas.microsoft.com/office/word/2018/wordml/cex" xmlns:w16cid="http://schemas.microsoft.com/office/word/2016/wordml/cid" xmlns:w16="http://schemas.microsoft.com/office/word/2018/wordml" xmlns:w16du="http://schemas.microsoft.com/office/word/2023/wordml/word16du" xmlns:w16sdtdh="http://schemas.microsoft.com/office/word/2020/wordml/sdtdatahash" xmlns:w16sdtfl="http://schemas.microsoft.com/office/word/2024/wordml/sdtformatlock" xmlns:w16se="http://schemas.microsoft.com/office/word/2015/wordml/symex" xmlns:wpg="http://schemas.microsoft.com/office/word/2010/wordprocessingGroup" xmlns:wpi="http://schemas.microsoft.com/office/word/2010/wordprocessingInk" xmlns:wne="http://schemas.microsoft.com/office/word/2006/wordml" xmlns:wps="http://schemas.microsoft.com/office/word/2010/wordprocessingShape" mc:Ignorable="w14 w15 w16se w16cid w16 w16cex w16sdtdh w16sdtfl w16du wp14">
   <w:body>
+    <w:p>
+      <w:pPr>
+        <w:rPr>
+          <w:lang w:val="en-US"/>
+        </w:rPr>
+      </w:pPr>
+      <w:r>
+        <w:rPr>
+          <w:lang w:val="en-US"/>
+        </w:rPr>
+        <w:t xml:space="preserve">Review and Integrate </w:t>
+      </w:r>
+      <w:proofErr w:type="spellStart"/>
+      <w:r>
+        <w:rPr>
+          <w:lang w:val="en-US"/>
+        </w:rPr>
+        <w:t>Gians</w:t>
+      </w:r>
+      <w:proofErr w:type="spellEnd"/>
+      <w:r>
+        <w:rPr>
+          <w:lang w:val="en-US"/>
+        </w:rPr>
+        <w:t xml:space="preserve"> Fe</w:t>
+      </w:r>
+      <w:r>
+        <w:rPr>
+          <w:lang w:val="en-US"/>
+        </w:rPr>
+        <w:t>edback</w:t>
+      </w:r>
+    </w:p>
+    <w:p>
+      <w:pPr>
+        <w:rPr>
+          <w:lang w:val="en-US"/>
+        </w:rPr>
+      </w:pPr>
+      <w:r>
+        <w:rPr>
+          <w:lang w:val="en-US"/>
+        </w:rPr>
+        <w:t xml:space="preserve">Re-structure Notebook 4 based on Outputs of </w:t>
+      </w:r>
+      <w:proofErr w:type="spellStart"/>
+      <w:r>
+        <w:rPr>
+          <w:lang w:val="en-US"/>
+        </w:rPr>
+        <w:t>Gözem’s</w:t>
+      </w:r>
+      <w:proofErr w:type="spellEnd"/>
+      <w:r>
+        <w:rPr>
+          <w:lang w:val="en-US"/>
+        </w:rPr>
+        <w:t xml:space="preserve"> paper – which sections will I need in the end? Then, adjust and </w:t>
+      </w:r>
+      <w:proofErr w:type="gramStart"/>
+      <w:r>
+        <w:rPr>
+          <w:lang w:val="en-US"/>
+        </w:rPr>
+        <w:t>comment</w:t>
+      </w:r>
+      <w:proofErr w:type="gramEnd"/>
+      <w:r>
+        <w:rPr>
+          <w:lang w:val="en-US"/>
+        </w:rPr>
+        <w:t xml:space="preserve"> the code.</w:t>
+      </w:r>
+    </w:p>
     <w:tbl>
       <w:tblPr>
         <w:tblStyle w:val="Tabellenraster"/>
+        <w:tblpPr w:leftFromText="141" w:rightFromText="141" w:horzAnchor="margin" w:tblpY="1496"/>
         <w:tblW w:w="0" w:type="auto"/>
         <w:tblLook w:val="04A0" w:firstRow="1" w:lastRow="0" w:firstColumn="1" w:lastColumn="0" w:noHBand="0" w:noVBand="1"/>
       </w:tblPr>
@@ -909,6 +984,7 @@
         <w:tc>
           <w:tcPr>
             <w:tcW w:w="3964" w:type="dxa"/>
+            <w:shd w:val="clear" w:color="auto" w:fill="C1F0C7" w:themeFill="accent3" w:themeFillTint="33"/>
           </w:tcPr>
           <w:p>
             <w:pPr>
@@ -959,6 +1035,7 @@
         <w:tc>
           <w:tcPr>
             <w:tcW w:w="2329" w:type="dxa"/>
+            <w:shd w:val="clear" w:color="auto" w:fill="C1F0C7" w:themeFill="accent3" w:themeFillTint="33"/>
           </w:tcPr>
           <w:p>
             <w:pPr>
@@ -981,6 +1058,7 @@
         <w:tc>
           <w:tcPr>
             <w:tcW w:w="2769" w:type="dxa"/>
+            <w:shd w:val="clear" w:color="auto" w:fill="C1F0C7" w:themeFill="accent3" w:themeFillTint="33"/>
           </w:tcPr>
           <w:p>
             <w:pPr>
@@ -1057,7 +1135,23 @@
                 <w:szCs w:val="22"/>
                 <w:lang w:val="en-US"/>
               </w:rPr>
-              <w:t>for all 19 participants</w:t>
+              <w:t xml:space="preserve">for all </w:t>
+            </w:r>
+            <w:r>
+              <w:rPr>
+                <w:sz w:val="22"/>
+                <w:szCs w:val="22"/>
+                <w:lang w:val="en-US"/>
+              </w:rPr>
+              <w:t>18</w:t>
+            </w:r>
+            <w:r>
+              <w:rPr>
+                <w:sz w:val="22"/>
+                <w:szCs w:val="22"/>
+                <w:lang w:val="en-US"/>
+              </w:rPr>
+              <w:t xml:space="preserve"> participants</w:t>
             </w:r>
           </w:p>
         </w:tc>
@@ -1149,7 +1243,7 @@
                 <w:szCs w:val="22"/>
                 <w:lang w:val="en-US"/>
               </w:rPr>
-              <w:t>Sharing what I have (Notebooks 1,2, 3 + preprocess_config.csv for IDs &gt; 19)</w:t>
+              <w:t>Sharing what I have (Notebooks 1,2, 3 + preprocess_config.csv for IDs &gt; 19</w:t>
             </w:r>
           </w:p>
           <w:p>
@@ -1588,7 +1682,23 @@
                 <w:szCs w:val="22"/>
                 <w:lang w:val="en-US"/>
               </w:rPr>
-              <w:t xml:space="preserve"> with 19 participants</w:t>
+              <w:t xml:space="preserve"> with </w:t>
+            </w:r>
+            <w:r>
+              <w:rPr>
+                <w:sz w:val="22"/>
+                <w:szCs w:val="22"/>
+                <w:lang w:val="en-US"/>
+              </w:rPr>
+              <w:t>18</w:t>
+            </w:r>
+            <w:r>
+              <w:rPr>
+                <w:sz w:val="22"/>
+                <w:szCs w:val="22"/>
+                <w:lang w:val="en-US"/>
+              </w:rPr>
+              <w:t xml:space="preserve"> participants</w:t>
             </w:r>
           </w:p>
         </w:tc>
@@ -1656,6 +1766,7 @@
                 <w:szCs w:val="22"/>
                 <w:lang w:val="en-US"/>
               </w:rPr>
+              <w:lastRenderedPageBreak/>
               <w:t xml:space="preserve">Share final script </w:t>
             </w:r>
             <w:r>
@@ -1911,51 +2022,18 @@
           </w:p>
         </w:tc>
       </w:tr>
-      <w:tr>
-        <w:tc>
-          <w:tcPr>
-            <w:tcW w:w="3964" w:type="dxa"/>
-          </w:tcPr>
-          <w:p>
-            <w:pPr>
-              <w:rPr>
-                <w:sz w:val="22"/>
-                <w:szCs w:val="22"/>
-                <w:lang w:val="en-US"/>
-              </w:rPr>
-            </w:pPr>
-          </w:p>
-        </w:tc>
-        <w:tc>
-          <w:tcPr>
-            <w:tcW w:w="2329" w:type="dxa"/>
-          </w:tcPr>
-          <w:p>
-            <w:pPr>
-              <w:rPr>
-                <w:sz w:val="22"/>
-                <w:szCs w:val="22"/>
-                <w:lang w:val="en-US"/>
-              </w:rPr>
-            </w:pPr>
-          </w:p>
-        </w:tc>
-        <w:tc>
-          <w:tcPr>
-            <w:tcW w:w="2769" w:type="dxa"/>
-          </w:tcPr>
-          <w:p>
-            <w:pPr>
-              <w:rPr>
-                <w:sz w:val="22"/>
-                <w:szCs w:val="22"/>
-                <w:lang w:val="en-US"/>
-              </w:rPr>
-            </w:pPr>
-          </w:p>
-        </w:tc>
-      </w:tr>
     </w:tbl>
+    <w:p>
+      <w:pPr>
+        <w:rPr>
+          <w:b/>
+          <w:bCs/>
+          <w:sz w:val="22"/>
+          <w:szCs w:val="22"/>
+          <w:lang w:val="en-US"/>
+        </w:rPr>
+      </w:pPr>
+    </w:p>
     <w:p>
       <w:pPr>
         <w:rPr>
@@ -1975,7 +2053,6 @@
           <w:szCs w:val="22"/>
           <w:lang w:val="en-US"/>
         </w:rPr>
-        <w:lastRenderedPageBreak/>
         <w:t>Meeting with</w:t>
       </w:r>
       <w:proofErr w:type="gramEnd"/>
@@ -2202,6 +2279,28 @@
         <w:pStyle w:val="Listenabsatz"/>
         <w:numPr>
           <w:ilvl w:val="0"/>
+          <w:numId w:val="4"/>
+        </w:numPr>
+        <w:rPr>
+          <w:sz w:val="22"/>
+          <w:szCs w:val="22"/>
+          <w:lang w:val="en-US"/>
+        </w:rPr>
+      </w:pPr>
+      <w:r>
+        <w:rPr>
+          <w:sz w:val="22"/>
+          <w:szCs w:val="22"/>
+          <w:lang w:val="en-US"/>
+        </w:rPr>
+        <w:t>Talk to Javier if we could include more participants for the EEG analysis (maybe only exclude those who fail retrieval)</w:t>
+      </w:r>
+    </w:p>
+    <w:p>
+      <w:pPr>
+        <w:pStyle w:val="Listenabsatz"/>
+        <w:numPr>
+          <w:ilvl w:val="0"/>
           <w:numId w:val="3"/>
         </w:numPr>
         <w:rPr>
@@ -2210,6 +2309,42 @@
           <w:lang w:val="en-US"/>
         </w:rPr>
       </w:pPr>
+      <w:proofErr w:type="spellStart"/>
+      <w:r>
+        <w:rPr>
+          <w:sz w:val="22"/>
+          <w:szCs w:val="22"/>
+          <w:lang w:val="en-US"/>
+        </w:rPr>
+        <w:t>Mhhh</w:t>
+      </w:r>
+      <w:proofErr w:type="spellEnd"/>
+      <w:r>
+        <w:rPr>
+          <w:sz w:val="22"/>
+          <w:szCs w:val="22"/>
+          <w:lang w:val="en-US"/>
+        </w:rPr>
+        <w:t xml:space="preserve">, no. I think I want to respect the pre-registered exclusion criteria, but I </w:t>
+      </w:r>
+      <w:proofErr w:type="gramStart"/>
+      <w:r>
+        <w:rPr>
+          <w:sz w:val="22"/>
+          <w:szCs w:val="22"/>
+          <w:lang w:val="en-US"/>
+        </w:rPr>
+        <w:t>definitely would</w:t>
+      </w:r>
+      <w:proofErr w:type="gramEnd"/>
+      <w:r>
+        <w:rPr>
+          <w:sz w:val="22"/>
+          <w:szCs w:val="22"/>
+          <w:lang w:val="en-US"/>
+        </w:rPr>
+        <w:t xml:space="preserve"> like to save the participants with the bug in encoding.</w:t>
+      </w:r>
     </w:p>
     <w:p>
       <w:pPr>
@@ -2239,9 +2374,171 @@
 </w:document>
 </file>
 
+<file path=word/endnotes.xml><?xml version="1.0" encoding="utf-8"?>
+<w:endnotes xmlns:wpc="http://schemas.microsoft.com/office/word/2010/wordprocessingCanvas" xmlns:cx="http://schemas.microsoft.com/office/drawing/2014/chartex" xmlns:cx1="http://schemas.microsoft.com/office/drawing/2015/9/8/chartex" xmlns:cx2="http://schemas.microsoft.com/office/drawing/2015/10/21/chartex" xmlns:cx3="http://schemas.microsoft.com/office/drawing/2016/5/9/chartex" xmlns:cx4="http://schemas.microsoft.com/office/drawing/2016/5/10/chartex" xmlns:cx5="http://schemas.microsoft.com/office/drawing/2016/5/11/chartex" xmlns:cx6="http://schemas.microsoft.com/office/drawing/2016/5/12/chartex" xmlns:cx7="http://schemas.microsoft.com/office/drawing/2016/5/13/chartex" xmlns:cx8="http://schemas.microsoft.com/office/drawing/2016/5/14/chartex" xmlns:mc="http://schemas.openxmlformats.org/markup-compatibility/2006" xmlns:aink="http://schemas.microsoft.com/office/drawing/2016/ink" xmlns:am3d="http://schemas.microsoft.com/office/drawing/2017/model3d" xmlns:o="urn:schemas-microsoft-com:office:office" xmlns:oel="http://schemas.microsoft.com/office/2019/extlst" xmlns:r="http://schemas.openxmlformats.org/officeDocument/2006/relationships" xmlns:m="http://schemas.openxmlformats.org/officeDocument/2006/math" xmlns:v="urn:schemas-microsoft-com:vml" xmlns:wp14="http://schemas.microsoft.com/office/word/2010/wordprocessingDrawing" xmlns:wp="http://schemas.openxmlformats.org/drawingml/2006/wordprocessingDrawing" xmlns:w10="urn:schemas-microsoft-com:office:word" xmlns:w="http://schemas.openxmlformats.org/wordprocessingml/2006/main" xmlns:w14="http://schemas.microsoft.com/office/word/2010/wordml" xmlns:w15="http://schemas.microsoft.com/office/word/2012/wordml" xmlns:w16cei="http://schemas.microsoft.com/office/word/2026/wordml/cei" xmlns:w16cex="http://schemas.microsoft.com/office/word/2018/wordml/cex" xmlns:w16cid="http://schemas.microsoft.com/office/word/2016/wordml/cid" xmlns:w16="http://schemas.microsoft.com/office/word/2018/wordml" xmlns:w16du="http://schemas.microsoft.com/office/word/2023/wordml/word16du" xmlns:w16sdtdh="http://schemas.microsoft.com/office/word/2020/wordml/sdtdatahash" xmlns:w16sdtfl="http://schemas.microsoft.com/office/word/2024/wordml/sdtformatlock" xmlns:w16se="http://schemas.microsoft.com/office/word/2015/wordml/symex" xmlns:wpg="http://schemas.microsoft.com/office/word/2010/wordprocessingGroup" xmlns:wpi="http://schemas.microsoft.com/office/word/2010/wordprocessingInk" xmlns:wne="http://schemas.microsoft.com/office/word/2006/wordml" xmlns:wps="http://schemas.microsoft.com/office/word/2010/wordprocessingShape" mc:Ignorable="w14 w15 w16se w16cid w16 w16cex w16sdtdh w16sdtfl w16du wp14">
+  <w:endnote w:type="separator" w:id="-1">
+    <w:p>
+      <w:pPr>
+        <w:spacing w:after="0" w:line="240" w:lineRule="auto"/>
+      </w:pPr>
+      <w:r>
+        <w:separator/>
+      </w:r>
+    </w:p>
+  </w:endnote>
+  <w:endnote w:type="continuationSeparator" w:id="0">
+    <w:p>
+      <w:pPr>
+        <w:spacing w:after="0" w:line="240" w:lineRule="auto"/>
+      </w:pPr>
+      <w:r>
+        <w:continuationSeparator/>
+      </w:r>
+    </w:p>
+  </w:endnote>
+</w:endnotes>
+</file>
+
+<file path=word/footnotes.xml><?xml version="1.0" encoding="utf-8"?>
+<w:footnotes xmlns:wpc="http://schemas.microsoft.com/office/word/2010/wordprocessingCanvas" xmlns:cx="http://schemas.microsoft.com/office/drawing/2014/chartex" xmlns:cx1="http://schemas.microsoft.com/office/drawing/2015/9/8/chartex" xmlns:cx2="http://schemas.microsoft.com/office/drawing/2015/10/21/chartex" xmlns:cx3="http://schemas.microsoft.com/office/drawing/2016/5/9/chartex" xmlns:cx4="http://schemas.microsoft.com/office/drawing/2016/5/10/chartex" xmlns:cx5="http://schemas.microsoft.com/office/drawing/2016/5/11/chartex" xmlns:cx6="http://schemas.microsoft.com/office/drawing/2016/5/12/chartex" xmlns:cx7="http://schemas.microsoft.com/office/drawing/2016/5/13/chartex" xmlns:cx8="http://schemas.microsoft.com/office/drawing/2016/5/14/chartex" xmlns:mc="http://schemas.openxmlformats.org/markup-compatibility/2006" xmlns:aink="http://schemas.microsoft.com/office/drawing/2016/ink" xmlns:am3d="http://schemas.microsoft.com/office/drawing/2017/model3d" xmlns:o="urn:schemas-microsoft-com:office:office" xmlns:oel="http://schemas.microsoft.com/office/2019/extlst" xmlns:r="http://schemas.openxmlformats.org/officeDocument/2006/relationships" xmlns:m="http://schemas.openxmlformats.org/officeDocument/2006/math" xmlns:v="urn:schemas-microsoft-com:vml" xmlns:wp14="http://schemas.microsoft.com/office/word/2010/wordprocessingDrawing" xmlns:wp="http://schemas.openxmlformats.org/drawingml/2006/wordprocessingDrawing" xmlns:w10="urn:schemas-microsoft-com:office:word" xmlns:w="http://schemas.openxmlformats.org/wordprocessingml/2006/main" xmlns:w14="http://schemas.microsoft.com/office/word/2010/wordml" xmlns:w15="http://schemas.microsoft.com/office/word/2012/wordml" xmlns:w16cei="http://schemas.microsoft.com/office/word/2026/wordml/cei" xmlns:w16cex="http://schemas.microsoft.com/office/word/2018/wordml/cex" xmlns:w16cid="http://schemas.microsoft.com/office/word/2016/wordml/cid" xmlns:w16="http://schemas.microsoft.com/office/word/2018/wordml" xmlns:w16du="http://schemas.microsoft.com/office/word/2023/wordml/word16du" xmlns:w16sdtdh="http://schemas.microsoft.com/office/word/2020/wordml/sdtdatahash" xmlns:w16sdtfl="http://schemas.microsoft.com/office/word/2024/wordml/sdtformatlock" xmlns:w16se="http://schemas.microsoft.com/office/word/2015/wordml/symex" xmlns:wpg="http://schemas.microsoft.com/office/word/2010/wordprocessingGroup" xmlns:wpi="http://schemas.microsoft.com/office/word/2010/wordprocessingInk" xmlns:wne="http://schemas.microsoft.com/office/word/2006/wordml" xmlns:wps="http://schemas.microsoft.com/office/word/2010/wordprocessingShape" mc:Ignorable="w14 w15 w16se w16cid w16 w16cex w16sdtdh w16sdtfl w16du wp14">
+  <w:footnote w:type="separator" w:id="-1">
+    <w:p>
+      <w:pPr>
+        <w:spacing w:after="0" w:line="240" w:lineRule="auto"/>
+      </w:pPr>
+      <w:r>
+        <w:separator/>
+      </w:r>
+    </w:p>
+  </w:footnote>
+  <w:footnote w:type="continuationSeparator" w:id="0">
+    <w:p>
+      <w:pPr>
+        <w:spacing w:after="0" w:line="240" w:lineRule="auto"/>
+      </w:pPr>
+      <w:r>
+        <w:continuationSeparator/>
+      </w:r>
+    </w:p>
+  </w:footnote>
+</w:footnotes>
+</file>
+
 <file path=word/numbering.xml><?xml version="1.0" encoding="utf-8"?>
-<w:numbering xmlns:wpc="http://schemas.microsoft.com/office/word/2010/wordprocessingCanvas" xmlns:cx="http://schemas.microsoft.com/office/drawing/2014/chartex" xmlns:cx1="http://schemas.microsoft.com/office/drawing/2015/9/8/chartex" xmlns:cx2="http://schemas.microsoft.com/office/drawing/2015/10/21/chartex" xmlns:cx3="http://schemas.microsoft.com/office/drawing/2016/5/9/chartex" xmlns:cx4="http://schemas.microsoft.com/office/drawing/2016/5/10/chartex" xmlns:cx5="http://schemas.microsoft.com/office/drawing/2016/5/11/chartex" xmlns:cx6="http://schemas.microsoft.com/office/drawing/2016/5/12/chartex" xmlns:cx7="http://schemas.microsoft.com/office/drawing/2016/5/13/chartex" xmlns:cx8="http://schemas.microsoft.com/office/drawing/2016/5/14/chartex" xmlns:mc="http://schemas.openxmlformats.org/markup-compatibility/2006" xmlns:aink="http://schemas.microsoft.com/office/drawing/2016/ink" xmlns:am3d="http://schemas.microsoft.com/office/drawing/2017/model3d" xmlns:o="urn:schemas-microsoft-com:office:office" xmlns:oel="http://schemas.microsoft.com/office/2019/extlst" xmlns:r="http://schemas.openxmlformats.org/officeDocument/2006/relationships" xmlns:m="http://schemas.openxmlformats.org/officeDocument/2006/math" xmlns:v="urn:schemas-microsoft-com:vml" xmlns:wp14="http://schemas.microsoft.com/office/word/2010/wordprocessingDrawing" xmlns:wp="http://schemas.openxmlformats.org/drawingml/2006/wordprocessingDrawing" xmlns:w10="urn:schemas-microsoft-com:office:word" xmlns:w="http://schemas.openxmlformats.org/wordprocessingml/2006/main" xmlns:w14="http://schemas.microsoft.com/office/word/2010/wordml" xmlns:w15="http://schemas.microsoft.com/office/word/2012/wordml" xmlns:w16cex="http://schemas.microsoft.com/office/word/2018/wordml/cex" xmlns:w16cid="http://schemas.microsoft.com/office/word/2016/wordml/cid" xmlns:w16="http://schemas.microsoft.com/office/word/2018/wordml" xmlns:w16du="http://schemas.microsoft.com/office/word/2023/wordml/word16du" xmlns:w16sdtdh="http://schemas.microsoft.com/office/word/2020/wordml/sdtdatahash" xmlns:w16sdtfl="http://schemas.microsoft.com/office/word/2024/wordml/sdtformatlock" xmlns:w16se="http://schemas.microsoft.com/office/word/2015/wordml/symex" xmlns:wpg="http://schemas.microsoft.com/office/word/2010/wordprocessingGroup" xmlns:wpi="http://schemas.microsoft.com/office/word/2010/wordprocessingInk" xmlns:wne="http://schemas.microsoft.com/office/word/2006/wordml" xmlns:wps="http://schemas.microsoft.com/office/word/2010/wordprocessingShape" mc:Ignorable="w14 w15 w16se w16cid w16 w16cex w16sdtdh w16sdtfl w16du wp14">
+<w:numbering xmlns:wpc="http://schemas.microsoft.com/office/word/2010/wordprocessingCanvas" xmlns:cx="http://schemas.microsoft.com/office/drawing/2014/chartex" xmlns:cx1="http://schemas.microsoft.com/office/drawing/2015/9/8/chartex" xmlns:cx2="http://schemas.microsoft.com/office/drawing/2015/10/21/chartex" xmlns:cx3="http://schemas.microsoft.com/office/drawing/2016/5/9/chartex" xmlns:cx4="http://schemas.microsoft.com/office/drawing/2016/5/10/chartex" xmlns:cx5="http://schemas.microsoft.com/office/drawing/2016/5/11/chartex" xmlns:cx6="http://schemas.microsoft.com/office/drawing/2016/5/12/chartex" xmlns:cx7="http://schemas.microsoft.com/office/drawing/2016/5/13/chartex" xmlns:cx8="http://schemas.microsoft.com/office/drawing/2016/5/14/chartex" xmlns:mc="http://schemas.openxmlformats.org/markup-compatibility/2006" xmlns:aink="http://schemas.microsoft.com/office/drawing/2016/ink" xmlns:am3d="http://schemas.microsoft.com/office/drawing/2017/model3d" xmlns:o="urn:schemas-microsoft-com:office:office" xmlns:oel="http://schemas.microsoft.com/office/2019/extlst" xmlns:r="http://schemas.openxmlformats.org/officeDocument/2006/relationships" xmlns:m="http://schemas.openxmlformats.org/officeDocument/2006/math" xmlns:v="urn:schemas-microsoft-com:vml" xmlns:wp14="http://schemas.microsoft.com/office/word/2010/wordprocessingDrawing" xmlns:wp="http://schemas.openxmlformats.org/drawingml/2006/wordprocessingDrawing" xmlns:w10="urn:schemas-microsoft-com:office:word" xmlns:w="http://schemas.openxmlformats.org/wordprocessingml/2006/main" xmlns:w14="http://schemas.microsoft.com/office/word/2010/wordml" xmlns:w15="http://schemas.microsoft.com/office/word/2012/wordml" xmlns:w16cei="http://schemas.microsoft.com/office/word/2026/wordml/cei" xmlns:w16cex="http://schemas.microsoft.com/office/word/2018/wordml/cex" xmlns:w16cid="http://schemas.microsoft.com/office/word/2016/wordml/cid" xmlns:w16="http://schemas.microsoft.com/office/word/2018/wordml" xmlns:w16du="http://schemas.microsoft.com/office/word/2023/wordml/word16du" xmlns:w16sdtdh="http://schemas.microsoft.com/office/word/2020/wordml/sdtdatahash" xmlns:w16sdtfl="http://schemas.microsoft.com/office/word/2024/wordml/sdtformatlock" xmlns:w16se="http://schemas.microsoft.com/office/word/2015/wordml/symex" xmlns:wpg="http://schemas.microsoft.com/office/word/2010/wordprocessingGroup" xmlns:wpi="http://schemas.microsoft.com/office/word/2010/wordprocessingInk" xmlns:wne="http://schemas.microsoft.com/office/word/2006/wordml" xmlns:wps="http://schemas.microsoft.com/office/word/2010/wordprocessingShape" mc:Ignorable="w14 w15 w16se w16cid w16 w16cex w16sdtdh w16sdtfl w16du wp14">
   <w:abstractNum w:abstractNumId="0" w15:restartNumberingAfterBreak="0">
+    <w:nsid w:val="0AF80E13"/>
+    <w:multiLevelType w:val="hybridMultilevel"/>
+    <w:tmpl w:val="FC9A5CF8"/>
+    <w:lvl w:ilvl="0" w:tplc="A34412C8">
+      <w:numFmt w:val="bullet"/>
+      <w:lvlText w:val="-"/>
+      <w:lvlJc w:val="left"/>
+      <w:pPr>
+        <w:ind w:left="720" w:hanging="360"/>
+      </w:pPr>
+      <w:rPr>
+        <w:rFonts w:ascii="Aptos" w:eastAsiaTheme="minorHAnsi" w:hAnsi="Aptos" w:cstheme="minorBidi" w:hint="default"/>
+      </w:rPr>
+    </w:lvl>
+    <w:lvl w:ilvl="1" w:tplc="04070003" w:tentative="1">
+      <w:start w:val="1"/>
+      <w:numFmt w:val="bullet"/>
+      <w:lvlText w:val="o"/>
+      <w:lvlJc w:val="left"/>
+      <w:pPr>
+        <w:ind w:left="1440" w:hanging="360"/>
+      </w:pPr>
+      <w:rPr>
+        <w:rFonts w:ascii="Courier New" w:hAnsi="Courier New" w:cs="Courier New" w:hint="default"/>
+      </w:rPr>
+    </w:lvl>
+    <w:lvl w:ilvl="2" w:tplc="04070005" w:tentative="1">
+      <w:start w:val="1"/>
+      <w:numFmt w:val="bullet"/>
+      <w:lvlText w:val=""/>
+      <w:lvlJc w:val="left"/>
+      <w:pPr>
+        <w:ind w:left="2160" w:hanging="360"/>
+      </w:pPr>
+      <w:rPr>
+        <w:rFonts w:ascii="Wingdings" w:hAnsi="Wingdings" w:hint="default"/>
+      </w:rPr>
+    </w:lvl>
+    <w:lvl w:ilvl="3" w:tplc="04070001" w:tentative="1">
+      <w:start w:val="1"/>
+      <w:numFmt w:val="bullet"/>
+      <w:lvlText w:val=""/>
+      <w:lvlJc w:val="left"/>
+      <w:pPr>
+        <w:ind w:left="2880" w:hanging="360"/>
+      </w:pPr>
+      <w:rPr>
+        <w:rFonts w:ascii="Symbol" w:hAnsi="Symbol" w:hint="default"/>
+      </w:rPr>
+    </w:lvl>
+    <w:lvl w:ilvl="4" w:tplc="04070003" w:tentative="1">
+      <w:start w:val="1"/>
+      <w:numFmt w:val="bullet"/>
+      <w:lvlText w:val="o"/>
+      <w:lvlJc w:val="left"/>
+      <w:pPr>
+        <w:ind w:left="3600" w:hanging="360"/>
+      </w:pPr>
+      <w:rPr>
+        <w:rFonts w:ascii="Courier New" w:hAnsi="Courier New" w:cs="Courier New" w:hint="default"/>
+      </w:rPr>
+    </w:lvl>
+    <w:lvl w:ilvl="5" w:tplc="04070005" w:tentative="1">
+      <w:start w:val="1"/>
+      <w:numFmt w:val="bullet"/>
+      <w:lvlText w:val=""/>
+      <w:lvlJc w:val="left"/>
+      <w:pPr>
+        <w:ind w:left="4320" w:hanging="360"/>
+      </w:pPr>
+      <w:rPr>
+        <w:rFonts w:ascii="Wingdings" w:hAnsi="Wingdings" w:hint="default"/>
+      </w:rPr>
+    </w:lvl>
+    <w:lvl w:ilvl="6" w:tplc="04070001" w:tentative="1">
+      <w:start w:val="1"/>
+      <w:numFmt w:val="bullet"/>
+      <w:lvlText w:val=""/>
+      <w:lvlJc w:val="left"/>
+      <w:pPr>
+        <w:ind w:left="5040" w:hanging="360"/>
+      </w:pPr>
+      <w:rPr>
+        <w:rFonts w:ascii="Symbol" w:hAnsi="Symbol" w:hint="default"/>
+      </w:rPr>
+    </w:lvl>
+    <w:lvl w:ilvl="7" w:tplc="04070003" w:tentative="1">
+      <w:start w:val="1"/>
+      <w:numFmt w:val="bullet"/>
+      <w:lvlText w:val="o"/>
+      <w:lvlJc w:val="left"/>
+      <w:pPr>
+        <w:ind w:left="5760" w:hanging="360"/>
+      </w:pPr>
+      <w:rPr>
+        <w:rFonts w:ascii="Courier New" w:hAnsi="Courier New" w:cs="Courier New" w:hint="default"/>
+      </w:rPr>
+    </w:lvl>
+    <w:lvl w:ilvl="8" w:tplc="04070005" w:tentative="1">
+      <w:start w:val="1"/>
+      <w:numFmt w:val="bullet"/>
+      <w:lvlText w:val=""/>
+      <w:lvlJc w:val="left"/>
+      <w:pPr>
+        <w:ind w:left="6480" w:hanging="360"/>
+      </w:pPr>
+      <w:rPr>
+        <w:rFonts w:ascii="Wingdings" w:hAnsi="Wingdings" w:hint="default"/>
+      </w:rPr>
+    </w:lvl>
+  </w:abstractNum>
+  <w:abstractNum w:abstractNumId="1" w15:restartNumberingAfterBreak="0">
     <w:nsid w:val="13D16924"/>
     <w:multiLevelType w:val="hybridMultilevel"/>
     <w:tmpl w:val="B810CFF8"/>
@@ -2354,7 +2651,7 @@
       </w:rPr>
     </w:lvl>
   </w:abstractNum>
-  <w:abstractNum w:abstractNumId="1" w15:restartNumberingAfterBreak="0">
+  <w:abstractNum w:abstractNumId="2" w15:restartNumberingAfterBreak="0">
     <w:nsid w:val="40AA6EF0"/>
     <w:multiLevelType w:val="hybridMultilevel"/>
     <w:tmpl w:val="399C8DB6"/>
@@ -2443,7 +2740,7 @@
       </w:pPr>
     </w:lvl>
   </w:abstractNum>
-  <w:abstractNum w:abstractNumId="2" w15:restartNumberingAfterBreak="0">
+  <w:abstractNum w:abstractNumId="3" w15:restartNumberingAfterBreak="0">
     <w:nsid w:val="64310A37"/>
     <w:multiLevelType w:val="hybridMultilevel"/>
     <w:tmpl w:val="0CF09766"/>
@@ -2453,7 +2750,7 @@
       <w:lvlText w:val=""/>
       <w:lvlJc w:val="left"/>
       <w:pPr>
-        <w:ind w:left="720" w:hanging="360"/>
+        <w:ind w:left="1068" w:hanging="360"/>
       </w:pPr>
       <w:rPr>
         <w:rFonts w:ascii="Symbol" w:hAnsi="Symbol" w:hint="default"/>
@@ -2465,7 +2762,7 @@
       <w:lvlText w:val="o"/>
       <w:lvlJc w:val="left"/>
       <w:pPr>
-        <w:ind w:left="1440" w:hanging="360"/>
+        <w:ind w:left="1788" w:hanging="360"/>
       </w:pPr>
       <w:rPr>
         <w:rFonts w:ascii="Courier New" w:hAnsi="Courier New" w:cs="Courier New" w:hint="default"/>
@@ -2477,7 +2774,7 @@
       <w:lvlText w:val=""/>
       <w:lvlJc w:val="left"/>
       <w:pPr>
-        <w:ind w:left="2160" w:hanging="360"/>
+        <w:ind w:left="2508" w:hanging="360"/>
       </w:pPr>
       <w:rPr>
         <w:rFonts w:ascii="Wingdings" w:hAnsi="Wingdings" w:hint="default"/>
@@ -2489,7 +2786,7 @@
       <w:lvlText w:val=""/>
       <w:lvlJc w:val="left"/>
       <w:pPr>
-        <w:ind w:left="2880" w:hanging="360"/>
+        <w:ind w:left="3228" w:hanging="360"/>
       </w:pPr>
       <w:rPr>
         <w:rFonts w:ascii="Symbol" w:hAnsi="Symbol" w:hint="default"/>
@@ -2501,7 +2798,7 @@
       <w:lvlText w:val="o"/>
       <w:lvlJc w:val="left"/>
       <w:pPr>
-        <w:ind w:left="3600" w:hanging="360"/>
+        <w:ind w:left="3948" w:hanging="360"/>
       </w:pPr>
       <w:rPr>
         <w:rFonts w:ascii="Courier New" w:hAnsi="Courier New" w:cs="Courier New" w:hint="default"/>
@@ -2513,7 +2810,7 @@
       <w:lvlText w:val=""/>
       <w:lvlJc w:val="left"/>
       <w:pPr>
-        <w:ind w:left="4320" w:hanging="360"/>
+        <w:ind w:left="4668" w:hanging="360"/>
       </w:pPr>
       <w:rPr>
         <w:rFonts w:ascii="Wingdings" w:hAnsi="Wingdings" w:hint="default"/>
@@ -2525,7 +2822,7 @@
       <w:lvlText w:val=""/>
       <w:lvlJc w:val="left"/>
       <w:pPr>
-        <w:ind w:left="5040" w:hanging="360"/>
+        <w:ind w:left="5388" w:hanging="360"/>
       </w:pPr>
       <w:rPr>
         <w:rFonts w:ascii="Symbol" w:hAnsi="Symbol" w:hint="default"/>
@@ -2537,7 +2834,7 @@
       <w:lvlText w:val="o"/>
       <w:lvlJc w:val="left"/>
       <w:pPr>
-        <w:ind w:left="5760" w:hanging="360"/>
+        <w:ind w:left="6108" w:hanging="360"/>
       </w:pPr>
       <w:rPr>
         <w:rFonts w:ascii="Courier New" w:hAnsi="Courier New" w:cs="Courier New" w:hint="default"/>
@@ -2549,21 +2846,140 @@
       <w:lvlText w:val=""/>
       <w:lvlJc w:val="left"/>
       <w:pPr>
-        <w:ind w:left="6480" w:hanging="360"/>
+        <w:ind w:left="6828" w:hanging="360"/>
       </w:pPr>
       <w:rPr>
         <w:rFonts w:ascii="Wingdings" w:hAnsi="Wingdings" w:hint="default"/>
       </w:rPr>
     </w:lvl>
   </w:abstractNum>
+  <w:abstractNum w:abstractNumId="4" w15:restartNumberingAfterBreak="0">
+    <w:nsid w:val="74070C9F"/>
+    <w:multiLevelType w:val="hybridMultilevel"/>
+    <w:tmpl w:val="CE5C1DDA"/>
+    <w:lvl w:ilvl="0" w:tplc="04070001">
+      <w:start w:val="1"/>
+      <w:numFmt w:val="bullet"/>
+      <w:lvlText w:val=""/>
+      <w:lvlJc w:val="left"/>
+      <w:pPr>
+        <w:ind w:left="3600" w:hanging="360"/>
+      </w:pPr>
+      <w:rPr>
+        <w:rFonts w:ascii="Symbol" w:hAnsi="Symbol" w:hint="default"/>
+      </w:rPr>
+    </w:lvl>
+    <w:lvl w:ilvl="1" w:tplc="04070003" w:tentative="1">
+      <w:start w:val="1"/>
+      <w:numFmt w:val="bullet"/>
+      <w:lvlText w:val="o"/>
+      <w:lvlJc w:val="left"/>
+      <w:pPr>
+        <w:ind w:left="4320" w:hanging="360"/>
+      </w:pPr>
+      <w:rPr>
+        <w:rFonts w:ascii="Courier New" w:hAnsi="Courier New" w:cs="Courier New" w:hint="default"/>
+      </w:rPr>
+    </w:lvl>
+    <w:lvl w:ilvl="2" w:tplc="04070005" w:tentative="1">
+      <w:start w:val="1"/>
+      <w:numFmt w:val="bullet"/>
+      <w:lvlText w:val=""/>
+      <w:lvlJc w:val="left"/>
+      <w:pPr>
+        <w:ind w:left="5040" w:hanging="360"/>
+      </w:pPr>
+      <w:rPr>
+        <w:rFonts w:ascii="Wingdings" w:hAnsi="Wingdings" w:hint="default"/>
+      </w:rPr>
+    </w:lvl>
+    <w:lvl w:ilvl="3" w:tplc="04070001" w:tentative="1">
+      <w:start w:val="1"/>
+      <w:numFmt w:val="bullet"/>
+      <w:lvlText w:val=""/>
+      <w:lvlJc w:val="left"/>
+      <w:pPr>
+        <w:ind w:left="5760" w:hanging="360"/>
+      </w:pPr>
+      <w:rPr>
+        <w:rFonts w:ascii="Symbol" w:hAnsi="Symbol" w:hint="default"/>
+      </w:rPr>
+    </w:lvl>
+    <w:lvl w:ilvl="4" w:tplc="04070003" w:tentative="1">
+      <w:start w:val="1"/>
+      <w:numFmt w:val="bullet"/>
+      <w:lvlText w:val="o"/>
+      <w:lvlJc w:val="left"/>
+      <w:pPr>
+        <w:ind w:left="6480" w:hanging="360"/>
+      </w:pPr>
+      <w:rPr>
+        <w:rFonts w:ascii="Courier New" w:hAnsi="Courier New" w:cs="Courier New" w:hint="default"/>
+      </w:rPr>
+    </w:lvl>
+    <w:lvl w:ilvl="5" w:tplc="04070005" w:tentative="1">
+      <w:start w:val="1"/>
+      <w:numFmt w:val="bullet"/>
+      <w:lvlText w:val=""/>
+      <w:lvlJc w:val="left"/>
+      <w:pPr>
+        <w:ind w:left="7200" w:hanging="360"/>
+      </w:pPr>
+      <w:rPr>
+        <w:rFonts w:ascii="Wingdings" w:hAnsi="Wingdings" w:hint="default"/>
+      </w:rPr>
+    </w:lvl>
+    <w:lvl w:ilvl="6" w:tplc="04070001" w:tentative="1">
+      <w:start w:val="1"/>
+      <w:numFmt w:val="bullet"/>
+      <w:lvlText w:val=""/>
+      <w:lvlJc w:val="left"/>
+      <w:pPr>
+        <w:ind w:left="7920" w:hanging="360"/>
+      </w:pPr>
+      <w:rPr>
+        <w:rFonts w:ascii="Symbol" w:hAnsi="Symbol" w:hint="default"/>
+      </w:rPr>
+    </w:lvl>
+    <w:lvl w:ilvl="7" w:tplc="04070003" w:tentative="1">
+      <w:start w:val="1"/>
+      <w:numFmt w:val="bullet"/>
+      <w:lvlText w:val="o"/>
+      <w:lvlJc w:val="left"/>
+      <w:pPr>
+        <w:ind w:left="8640" w:hanging="360"/>
+      </w:pPr>
+      <w:rPr>
+        <w:rFonts w:ascii="Courier New" w:hAnsi="Courier New" w:cs="Courier New" w:hint="default"/>
+      </w:rPr>
+    </w:lvl>
+    <w:lvl w:ilvl="8" w:tplc="04070005" w:tentative="1">
+      <w:start w:val="1"/>
+      <w:numFmt w:val="bullet"/>
+      <w:lvlText w:val=""/>
+      <w:lvlJc w:val="left"/>
+      <w:pPr>
+        <w:ind w:left="9360" w:hanging="360"/>
+      </w:pPr>
+      <w:rPr>
+        <w:rFonts w:ascii="Wingdings" w:hAnsi="Wingdings" w:hint="default"/>
+      </w:rPr>
+    </w:lvl>
+  </w:abstractNum>
   <w:num w:numId="1" w16cid:durableId="1024091716">
+    <w:abstractNumId w:val="2"/>
+  </w:num>
+  <w:num w:numId="2" w16cid:durableId="298809218">
     <w:abstractNumId w:val="1"/>
   </w:num>
-  <w:num w:numId="2" w16cid:durableId="298809218">
+  <w:num w:numId="3" w16cid:durableId="848519593">
+    <w:abstractNumId w:val="3"/>
+  </w:num>
+  <w:num w:numId="4" w16cid:durableId="1639843778">
     <w:abstractNumId w:val="0"/>
   </w:num>
-  <w:num w:numId="3" w16cid:durableId="848519593">
-    <w:abstractNumId w:val="2"/>
+  <w:num w:numId="5" w16cid:durableId="1125349259">
+    <w:abstractNumId w:val="4"/>
   </w:num>
 </w:numbering>
 </file>
@@ -3504,6 +3920,50 @@
       </w:tblBorders>
     </w:tblPr>
   </w:style>
+  <w:style w:type="paragraph" w:styleId="Kopfzeile">
+    <w:name w:val="header"/>
+    <w:basedOn w:val="Standard"/>
+    <w:link w:val="KopfzeileZchn"/>
+    <w:uiPriority w:val="99"/>
+    <w:unhideWhenUsed/>
+    <w:rsid w:val="0097164D"/>
+    <w:pPr>
+      <w:tabs>
+        <w:tab w:val="center" w:pos="4536"/>
+        <w:tab w:val="right" w:pos="9072"/>
+      </w:tabs>
+      <w:spacing w:after="0" w:line="240" w:lineRule="auto"/>
+    </w:pPr>
+  </w:style>
+  <w:style w:type="character" w:customStyle="1" w:styleId="KopfzeileZchn">
+    <w:name w:val="Kopfzeile Zchn"/>
+    <w:basedOn w:val="Absatz-Standardschriftart"/>
+    <w:link w:val="Kopfzeile"/>
+    <w:uiPriority w:val="99"/>
+    <w:rsid w:val="0097164D"/>
+  </w:style>
+  <w:style w:type="paragraph" w:styleId="Fuzeile">
+    <w:name w:val="footer"/>
+    <w:basedOn w:val="Standard"/>
+    <w:link w:val="FuzeileZchn"/>
+    <w:uiPriority w:val="99"/>
+    <w:unhideWhenUsed/>
+    <w:rsid w:val="0097164D"/>
+    <w:pPr>
+      <w:tabs>
+        <w:tab w:val="center" w:pos="4536"/>
+        <w:tab w:val="right" w:pos="9072"/>
+      </w:tabs>
+      <w:spacing w:after="0" w:line="240" w:lineRule="auto"/>
+    </w:pPr>
+  </w:style>
+  <w:style w:type="character" w:customStyle="1" w:styleId="FuzeileZchn">
+    <w:name w:val="Fußzeile Zchn"/>
+    <w:basedOn w:val="Absatz-Standardschriftart"/>
+    <w:link w:val="Fuzeile"/>
+    <w:uiPriority w:val="99"/>
+    <w:rsid w:val="0097164D"/>
+  </w:style>
 </w:styles>
 </file>
 

</xml_diff>